<commit_message>
Chamados: gera Relatorio de Servico preenchido a partir do template oficial (garantia, italia, equipamento, reclamacao, acoes, tecnico)
Corrige bug critico no processador de templates .docx: uma regex com backtracking podia
engolir texto real como se fosse formatacao, perdendo trechos em runs interrompidos por
<w:br/>. Reprocessa e substitui os 10 templates de RME afetados (nenhuma perda de dado
detectavel apos validacao por contagem de paragrafos/palavras) e usa a versao corrigida
para o novo template de Relatorio de Servico.

Co-Authored-By: Claude Sonnet 5 <noreply@anthropic.com>
</commit_message>
<xml_diff>
--- a/backend/templates/rme/BLACK TECH.docx
+++ b/backend/templates/rme/BLACK TECH.docx
@@ -48,7 +48,27 @@
           <w:sz w:val="20"/>
           <w:szCs w:val="20"/>
         </w:rPr>
-        <w:t xml:space="preserve">CLIENTE: {{CLIENTE}} EQUIPAMENTO:   Exact Black Tech X Plus                                   SERIE: {{SERIE}} </w:t>
+        <w:t xml:space="preserve">CLIENTE: {{CLIENTE}} </w:t>
+      </w:r>
+      <w:r>
+        <w:rPr>
+          <w:rFonts w:ascii="Arial" w:hAnsi="Arial" w:cs="Arial"/>
+          <w:b/>
+          <w:bCs/>
+          <w:sz w:val="20"/>
+          <w:szCs w:val="20"/>
+        </w:rPr>
+        <w:br/>
+      </w:r>
+      <w:r>
+        <w:rPr>
+          <w:rFonts w:ascii="Arial" w:hAnsi="Arial" w:cs="Arial"/>
+          <w:b/>
+          <w:bCs/>
+          <w:sz w:val="20"/>
+          <w:szCs w:val="20"/>
+        </w:rPr>
+        <w:t xml:space="preserve">EQUIPAMENTO:   Exact Black Tech X Plus                                   SERIE: {{SERIE}} </w:t>
       </w:r>
     </w:p>
     <w:p>

</xml_diff>